<commit_message>
updated lab exam sample file
</commit_message>
<xml_diff>
--- a/lab_exam_sample.docx
+++ b/lab_exam_sample.docx
@@ -15,10 +15,10 @@
         <w:tblLook w:val="04A0" w:firstRow="1" w:lastRow="0" w:firstColumn="1" w:lastColumn="0" w:noHBand="0" w:noVBand="1"/>
       </w:tblPr>
       <w:tblGrid>
-        <w:gridCol w:w="1598"/>
-        <w:gridCol w:w="3642"/>
-        <w:gridCol w:w="4071"/>
-        <w:gridCol w:w="1623"/>
+        <w:gridCol w:w="1607"/>
+        <w:gridCol w:w="3753"/>
+        <w:gridCol w:w="4169"/>
+        <w:gridCol w:w="1405"/>
       </w:tblGrid>
       <w:tr>
         <w:trPr>
@@ -222,126 +222,222 @@
         </w:tc>
       </w:tr>
     </w:tbl>
-    <w:p/>
-    <w:p/>
-    <w:p>
-      <w:r>
+    <w:p>
+      <w:pPr>
+        <w:rPr>
+          <w:rFonts w:ascii="Ebrima" w:hAnsi="Ebrima"/>
+        </w:rPr>
+      </w:pPr>
+    </w:p>
+    <w:p>
+      <w:pPr>
+        <w:jc w:val="both"/>
         <w:rPr>
           <w:b/>
           <w:bCs/>
         </w:rPr>
-        <w:t>Question:</w:t>
-      </w:r>
-      <w:r>
-        <w:t xml:space="preserve"> Desing the HTML page following the steps – </w:t>
-      </w:r>
-    </w:p>
-    <w:p>
-      <w:pPr>
-        <w:pStyle w:val="ListParagraph"/>
+      </w:pPr>
+    </w:p>
+    <w:p>
+      <w:pPr>
+        <w:jc w:val="both"/>
+        <w:rPr>
+          <w:b/>
+          <w:bCs/>
+        </w:rPr>
+      </w:pPr>
+      <w:r>
+        <w:rPr>
+          <w:b/>
+          <w:bCs/>
+        </w:rPr>
+        <w:t>Task: Design an HTML web page by following these steps:</w:t>
+      </w:r>
+    </w:p>
+    <w:p>
+      <w:pPr>
         <w:numPr>
           <w:ilvl w:val="0"/>
-          <w:numId w:val="1"/>
+          <w:numId w:val="2"/>
         </w:numPr>
-      </w:pPr>
-      <w:r>
-        <w:t>Have to follow the semantic html design pattern.</w:t>
-      </w:r>
-    </w:p>
-    <w:p>
-      <w:pPr>
-        <w:pStyle w:val="ListParagraph"/>
+        <w:jc w:val="both"/>
+      </w:pPr>
+      <w:r>
+        <w:t>Use semantic HTML tags (like &lt;header&gt;, &lt;nav&gt;, &lt;main&gt;, &lt;section&gt;, &lt;footer&gt;, etc.).</w:t>
+      </w:r>
+    </w:p>
+    <w:p>
+      <w:pPr>
         <w:numPr>
           <w:ilvl w:val="0"/>
-          <w:numId w:val="1"/>
+          <w:numId w:val="2"/>
         </w:numPr>
-      </w:pPr>
-      <w:r>
-        <w:t>Separate the divisions using a background color or a solid border.</w:t>
-      </w:r>
-    </w:p>
-    <w:p>
-      <w:pPr>
-        <w:pStyle w:val="ListParagraph"/>
+        <w:jc w:val="both"/>
+      </w:pPr>
+      <w:r>
+        <w:t>Separate each section using a background color or a solid border.</w:t>
+      </w:r>
+    </w:p>
+    <w:p>
+      <w:pPr>
         <w:numPr>
           <w:ilvl w:val="0"/>
-          <w:numId w:val="1"/>
+          <w:numId w:val="2"/>
         </w:numPr>
-      </w:pPr>
-      <w:r>
-        <w:t>The nav bar has to be sticky. The right side of the nav bar should contain your ID.</w:t>
-      </w:r>
-    </w:p>
-    <w:p>
-      <w:pPr>
-        <w:pStyle w:val="ListParagraph"/>
+        <w:jc w:val="both"/>
+      </w:pPr>
+      <w:r>
+        <w:t>The navigation bar (nav bar) must be sticky (it should stay at the top when scrolling).</w:t>
+      </w:r>
+    </w:p>
+    <w:p>
+      <w:pPr>
+        <w:numPr>
+          <w:ilvl w:val="1"/>
+          <w:numId w:val="2"/>
+        </w:numPr>
+        <w:jc w:val="both"/>
+      </w:pPr>
+      <w:r>
+        <w:t>On the right side of the nav bar, show your student ID.</w:t>
+      </w:r>
+    </w:p>
+    <w:p>
+      <w:pPr>
         <w:numPr>
           <w:ilvl w:val="0"/>
-          <w:numId w:val="1"/>
+          <w:numId w:val="2"/>
         </w:numPr>
-      </w:pPr>
-      <w:r>
-        <w:t>Footer will also contain your Id at the end.</w:t>
-      </w:r>
-    </w:p>
-    <w:p>
-      <w:pPr>
-        <w:pStyle w:val="ListParagraph"/>
+        <w:jc w:val="both"/>
+      </w:pPr>
+      <w:r>
+        <w:t>In the footer, also write your student ID at the end.</w:t>
+      </w:r>
+    </w:p>
+    <w:p>
+      <w:pPr>
         <w:numPr>
           <w:ilvl w:val="0"/>
-          <w:numId w:val="1"/>
+          <w:numId w:val="2"/>
         </w:numPr>
-      </w:pPr>
-      <w:r>
-        <w:t xml:space="preserve">You have to submit </w:t>
-      </w:r>
-      <w:r>
-        <w:t xml:space="preserve">a physical copy of </w:t>
-      </w:r>
-      <w:r>
-        <w:t>this Lab Exam</w:t>
-      </w:r>
-      <w:r>
-        <w:t>. So, using this word file – make a pdf file by adding code snippets as well as the output snippets.</w:t>
-      </w:r>
-    </w:p>
-    <w:p>
-      <w:pPr>
-        <w:pStyle w:val="ListParagraph"/>
+        <w:jc w:val="both"/>
+      </w:pPr>
+      <w:r>
+        <w:t>After finishing your code, create a PDF file that includes:</w:t>
+      </w:r>
+    </w:p>
+    <w:p>
+      <w:pPr>
+        <w:numPr>
+          <w:ilvl w:val="1"/>
+          <w:numId w:val="2"/>
+        </w:numPr>
+        <w:jc w:val="both"/>
+      </w:pPr>
+      <w:r>
+        <w:t>Your HTML code snippets</w:t>
+      </w:r>
+    </w:p>
+    <w:p>
+      <w:pPr>
+        <w:numPr>
+          <w:ilvl w:val="1"/>
+          <w:numId w:val="2"/>
+        </w:numPr>
+        <w:jc w:val="both"/>
+      </w:pPr>
+      <w:r>
+        <w:t>The output screenshots of your webpage</w:t>
+      </w:r>
+    </w:p>
+    <w:p>
+      <w:pPr>
         <w:numPr>
           <w:ilvl w:val="0"/>
-          <w:numId w:val="1"/>
+          <w:numId w:val="2"/>
         </w:numPr>
         <w:jc w:val="both"/>
       </w:pPr>
       <w:r>
-        <w:t>You have to print this pdf file and submit it to the department.</w:t>
-      </w:r>
-    </w:p>
-    <w:p>
-      <w:pPr>
-        <w:pStyle w:val="ListParagraph"/>
+        <w:t>You have to p</w:t>
+      </w:r>
+      <w:r>
+        <w:t xml:space="preserve">rint the PDF file and submit it to </w:t>
+      </w:r>
+      <w:r>
+        <w:t>the</w:t>
+      </w:r>
+      <w:r>
+        <w:t xml:space="preserve"> department.</w:t>
+      </w:r>
+      <w:r>
+        <w:t xml:space="preserve"> So, you must save a copy of the PDF file for yourself.</w:t>
+      </w:r>
+    </w:p>
+    <w:p>
+      <w:pPr>
         <w:numPr>
           <w:ilvl w:val="0"/>
-          <w:numId w:val="1"/>
+          <w:numId w:val="2"/>
         </w:numPr>
         <w:jc w:val="both"/>
       </w:pPr>
       <w:r>
-        <w:t>From 60 minutes – use 50 minutes for coding and last 10 minutes to make the pdf file.</w:t>
-      </w:r>
-    </w:p>
-    <w:p>
-      <w:pPr>
-        <w:pStyle w:val="ListParagraph"/>
+        <w:t>You will get 60 minutes total:</w:t>
+      </w:r>
+    </w:p>
+    <w:p>
+      <w:pPr>
+        <w:numPr>
+          <w:ilvl w:val="1"/>
+          <w:numId w:val="2"/>
+        </w:numPr>
+        <w:jc w:val="both"/>
+      </w:pPr>
+      <w:r>
+        <w:t>50 minutes for coding</w:t>
+      </w:r>
+    </w:p>
+    <w:p>
+      <w:pPr>
+        <w:numPr>
+          <w:ilvl w:val="1"/>
+          <w:numId w:val="2"/>
+        </w:numPr>
+        <w:jc w:val="both"/>
+      </w:pPr>
+      <w:r>
+        <w:t>10 minutes to make the PDF file.</w:t>
+      </w:r>
+    </w:p>
+    <w:p>
+      <w:pPr>
         <w:numPr>
           <w:ilvl w:val="0"/>
-          <w:numId w:val="1"/>
+          <w:numId w:val="2"/>
         </w:numPr>
         <w:jc w:val="both"/>
       </w:pPr>
       <w:r>
-        <w:t>The editable file is available in the following link</w:t>
+        <w:t xml:space="preserve">The editable </w:t>
+      </w:r>
+      <w:r>
+        <w:t>doc</w:t>
+      </w:r>
+      <w:r>
+        <w:t xml:space="preserve"> file is available from the link provided</w:t>
+      </w:r>
+      <w:r>
+        <w:t xml:space="preserve"> bellow:</w:t>
+      </w:r>
+    </w:p>
+    <w:p>
+      <w:pPr>
+        <w:ind w:left="720"/>
+        <w:jc w:val="both"/>
+      </w:pPr>
+      <w:r>
+        <w:t>https://github.com/asl-rnd/web_programming/blob/main/lab_exam_sample.docx</w:t>
       </w:r>
     </w:p>
     <w:p>
@@ -570,8 +666,128 @@
       </w:pPr>
     </w:lvl>
   </w:abstractNum>
+  <w:abstractNum w:abstractNumId="1" w15:restartNumberingAfterBreak="0">
+    <w:nsid w:val="18CA2B1B"/>
+    <w:multiLevelType w:val="multilevel"/>
+    <w:tmpl w:val="B40A926A"/>
+    <w:lvl w:ilvl="0">
+      <w:start w:val="1"/>
+      <w:numFmt w:val="decimal"/>
+      <w:lvlText w:val="%1."/>
+      <w:lvlJc w:val="left"/>
+      <w:pPr>
+        <w:tabs>
+          <w:tab w:val="num" w:pos="720"/>
+        </w:tabs>
+        <w:ind w:left="720" w:hanging="360"/>
+      </w:pPr>
+    </w:lvl>
+    <w:lvl w:ilvl="1">
+      <w:start w:val="1"/>
+      <w:numFmt w:val="bullet"/>
+      <w:lvlText w:val="o"/>
+      <w:lvlJc w:val="left"/>
+      <w:pPr>
+        <w:tabs>
+          <w:tab w:val="num" w:pos="1440"/>
+        </w:tabs>
+        <w:ind w:left="1440" w:hanging="360"/>
+      </w:pPr>
+      <w:rPr>
+        <w:rFonts w:ascii="Courier New" w:hAnsi="Courier New" w:hint="default"/>
+        <w:sz w:val="20"/>
+      </w:rPr>
+    </w:lvl>
+    <w:lvl w:ilvl="2" w:tentative="1">
+      <w:start w:val="1"/>
+      <w:numFmt w:val="decimal"/>
+      <w:lvlText w:val="%3."/>
+      <w:lvlJc w:val="left"/>
+      <w:pPr>
+        <w:tabs>
+          <w:tab w:val="num" w:pos="2160"/>
+        </w:tabs>
+        <w:ind w:left="2160" w:hanging="360"/>
+      </w:pPr>
+    </w:lvl>
+    <w:lvl w:ilvl="3" w:tentative="1">
+      <w:start w:val="1"/>
+      <w:numFmt w:val="decimal"/>
+      <w:lvlText w:val="%4."/>
+      <w:lvlJc w:val="left"/>
+      <w:pPr>
+        <w:tabs>
+          <w:tab w:val="num" w:pos="2880"/>
+        </w:tabs>
+        <w:ind w:left="2880" w:hanging="360"/>
+      </w:pPr>
+    </w:lvl>
+    <w:lvl w:ilvl="4" w:tentative="1">
+      <w:start w:val="1"/>
+      <w:numFmt w:val="decimal"/>
+      <w:lvlText w:val="%5."/>
+      <w:lvlJc w:val="left"/>
+      <w:pPr>
+        <w:tabs>
+          <w:tab w:val="num" w:pos="3600"/>
+        </w:tabs>
+        <w:ind w:left="3600" w:hanging="360"/>
+      </w:pPr>
+    </w:lvl>
+    <w:lvl w:ilvl="5" w:tentative="1">
+      <w:start w:val="1"/>
+      <w:numFmt w:val="decimal"/>
+      <w:lvlText w:val="%6."/>
+      <w:lvlJc w:val="left"/>
+      <w:pPr>
+        <w:tabs>
+          <w:tab w:val="num" w:pos="4320"/>
+        </w:tabs>
+        <w:ind w:left="4320" w:hanging="360"/>
+      </w:pPr>
+    </w:lvl>
+    <w:lvl w:ilvl="6" w:tentative="1">
+      <w:start w:val="1"/>
+      <w:numFmt w:val="decimal"/>
+      <w:lvlText w:val="%7."/>
+      <w:lvlJc w:val="left"/>
+      <w:pPr>
+        <w:tabs>
+          <w:tab w:val="num" w:pos="5040"/>
+        </w:tabs>
+        <w:ind w:left="5040" w:hanging="360"/>
+      </w:pPr>
+    </w:lvl>
+    <w:lvl w:ilvl="7" w:tentative="1">
+      <w:start w:val="1"/>
+      <w:numFmt w:val="decimal"/>
+      <w:lvlText w:val="%8."/>
+      <w:lvlJc w:val="left"/>
+      <w:pPr>
+        <w:tabs>
+          <w:tab w:val="num" w:pos="5760"/>
+        </w:tabs>
+        <w:ind w:left="5760" w:hanging="360"/>
+      </w:pPr>
+    </w:lvl>
+    <w:lvl w:ilvl="8" w:tentative="1">
+      <w:start w:val="1"/>
+      <w:numFmt w:val="decimal"/>
+      <w:lvlText w:val="%9."/>
+      <w:lvlJc w:val="left"/>
+      <w:pPr>
+        <w:tabs>
+          <w:tab w:val="num" w:pos="6480"/>
+        </w:tabs>
+        <w:ind w:left="6480" w:hanging="360"/>
+      </w:pPr>
+    </w:lvl>
+  </w:abstractNum>
   <w:num w:numId="1" w16cid:durableId="78259559">
     <w:abstractNumId w:val="0"/>
+  </w:num>
+  <w:num w:numId="2" w16cid:durableId="1118062598">
+    <w:abstractNumId w:val="1"/>
   </w:num>
 </w:numbering>
 </file>
@@ -581,7 +797,7 @@
   <w:docDefaults>
     <w:rPrDefault>
       <w:rPr>
-        <w:rFonts w:ascii="Cascadia Mono" w:eastAsiaTheme="minorHAnsi" w:hAnsi="Cascadia Mono" w:cstheme="minorBidi"/>
+        <w:rFonts w:ascii="Aptos Display" w:eastAsiaTheme="minorHAnsi" w:hAnsi="Aptos Display" w:cstheme="minorBidi"/>
         <w:kern w:val="2"/>
         <w:sz w:val="24"/>
         <w:szCs w:val="24"/>
@@ -1555,6 +1771,17 @@
       </w:tblBorders>
     </w:tblPr>
   </w:style>
+  <w:style w:type="paragraph" w:styleId="NormalWeb">
+    <w:name w:val="Normal (Web)"/>
+    <w:basedOn w:val="Normal"/>
+    <w:uiPriority w:val="99"/>
+    <w:semiHidden/>
+    <w:unhideWhenUsed/>
+    <w:rsid w:val="00A80F48"/>
+    <w:rPr>
+      <w:rFonts w:ascii="Times New Roman" w:hAnsi="Times New Roman" w:cs="Times New Roman"/>
+    </w:rPr>
+  </w:style>
 </w:styles>
 </file>
 

</xml_diff>